<commit_message>
New update for V2.0.1
</commit_message>
<xml_diff>
--- a/analysis/paper/Comparative_review_APM-ASD_V2.0.1.docx
+++ b/analysis/paper/Comparative_review_APM-ASD_V2.0.1.docx
@@ -47,7 +47,7 @@
         <w:pStyle w:val="Date"/>
       </w:pPr>
       <w:r>
-        <w:t xml:space="preserve">March 5, 2026</w:t>
+        <w:t xml:space="preserve">March 6, 2026</w:t>
       </w:r>
     </w:p>
     <w:p>
@@ -6620,7 +6620,7 @@
           <w:rPr>
             <w:rStyle w:val="Hyperlink"/>
           </w:rPr>
-          <w:t xml:space="preserve">https://doi.org/10.5281/zenodo.18877468</w:t>
+          <w:t xml:space="preserve">https://doi.org/10.5281/zenodo.18882443</w:t>
         </w:r>
       </w:hyperlink>
       <w:r>

</xml_diff>